<commit_message>
Remove vision libs (OpenCV, YOLO, Ultralytics), swap LangChain->LangGraph, fix skills categorization, trim Oracle deploy line
</commit_message>
<xml_diff>
--- a/Krish_Rakholiya_Resume.docx
+++ b/Krish_Rakholiya_Resume.docx
@@ -79,76 +79,146 @@
         <w:t>TECHNICAL SKILLS</w:t>
       </w:r>
     </w:p>
-    <w:p>
-      <w:pPr>
-        <w:spacing w:line="223" w:lineRule="auto"/>
-      </w:pPr>
-      <w:r>
-        <w:rPr>
-          <w:b/>
-        </w:rPr>
-        <w:t xml:space="preserve">Languages: </w:t>
-      </w:r>
-      <w:r>
-        <w:t>Python, C/C++, Java, SQL</w:t>
-      </w:r>
-    </w:p>
-    <w:p>
-      <w:pPr>
-        <w:spacing w:line="223" w:lineRule="auto"/>
-      </w:pPr>
-      <w:r>
-        <w:rPr>
-          <w:b/>
-        </w:rPr>
-        <w:t xml:space="preserve">ML &amp; AI: </w:t>
-      </w:r>
-      <w:r>
-        <w:t>Machine Learning, Deep Learning, Computer Vision, NLP, CNN, LSTM/GRU, GANs, Stable Diffusion, Transfer Learning, Unsupervised Learning, Time Series Forecasting, LLMs</w:t>
-      </w:r>
-    </w:p>
-    <w:p>
-      <w:pPr>
-        <w:spacing w:line="223" w:lineRule="auto"/>
-      </w:pPr>
-      <w:r>
-        <w:rPr>
-          <w:b/>
-        </w:rPr>
-        <w:t xml:space="preserve">AI Tools &amp; APIs: </w:t>
-      </w:r>
-      <w:r>
-        <w:t>HuggingFace, YOLOv8/v11, Ultralytics, Google Gemini, Groq (GPT-OSS), OpenCode, LangChain</w:t>
-      </w:r>
-    </w:p>
-    <w:p>
-      <w:pPr>
-        <w:spacing w:line="223" w:lineRule="auto"/>
-      </w:pPr>
-      <w:r>
-        <w:rPr>
-          <w:b/>
-        </w:rPr>
-        <w:t xml:space="preserve">Frameworks: </w:t>
-      </w:r>
-      <w:r>
-        <w:t>FastAPI, Flask, TensorFlow/Keras, Scikit-learn, Pandas, NumPy, OpenCV, Streamlit, Matplotlib/Seaborn, Docker</w:t>
-      </w:r>
-    </w:p>
-    <w:p>
-      <w:pPr>
-        <w:spacing w:line="223" w:lineRule="auto"/>
-      </w:pPr>
-      <w:r>
-        <w:rPr>
-          <w:b/>
-        </w:rPr>
-        <w:t xml:space="preserve">Databases &amp; Cloud: </w:t>
-      </w:r>
-      <w:r>
-        <w:t>PostgreSQL, Jupyter Notebook, Google Colab, Kaggle</w:t>
-      </w:r>
-    </w:p>
+    <w:tbl>
+      <w:tblPr>
+        <w:tblW w:w="0" w:type="auto"/>
+        <w:tblLayout w:type="fixed"/>
+        <w:tblCellMar>
+          <w:left w:w="50" w:type="dxa"/>
+          <w:right w:w="50" w:type="dxa"/>
+        </w:tblCellMar>
+        <w:tblLook w:val="04A0" w:firstRow="1" w:lastRow="0" w:firstColumn="1" w:lastColumn="0" w:noHBand="0" w:noVBand="1"/>
+      </w:tblPr>
+      <w:tblGrid>
+        <w:gridCol w:w="1944"/>
+        <w:gridCol w:w="8856"/>
+      </w:tblGrid>
+      <w:tr>
+        <w:tc>
+          <w:tcPr>
+            <w:tcW w:w="1944" w:type="dxa"/>
+          </w:tcPr>
+          <w:p>
+            <w:r>
+              <w:rPr>
+                <w:b/>
+              </w:rPr>
+              <w:t>Languages:</w:t>
+            </w:r>
+          </w:p>
+        </w:tc>
+        <w:tc>
+          <w:tcPr>
+            <w:tcW w:w="8856" w:type="dxa"/>
+          </w:tcPr>
+          <w:p>
+            <w:r>
+              <w:t>Python, C/C++, Java, SQL</w:t>
+            </w:r>
+          </w:p>
+        </w:tc>
+      </w:tr>
+      <w:tr>
+        <w:tc>
+          <w:tcPr>
+            <w:tcW w:w="1944" w:type="dxa"/>
+          </w:tcPr>
+          <w:p>
+            <w:r>
+              <w:rPr>
+                <w:b/>
+              </w:rPr>
+              <w:t>ML &amp; AI:</w:t>
+            </w:r>
+          </w:p>
+        </w:tc>
+        <w:tc>
+          <w:tcPr>
+            <w:tcW w:w="8856" w:type="dxa"/>
+          </w:tcPr>
+          <w:p>
+            <w:r>
+              <w:t>Machine Learning, Deep Learning, Computer Vision, NLP, CNN, LSTM/GRU, GANs, Stable Diffusion, Transfer Learning, Unsupervised Learning, Time Series Forecasting, LLMs</w:t>
+            </w:r>
+          </w:p>
+        </w:tc>
+      </w:tr>
+      <w:tr>
+        <w:tc>
+          <w:tcPr>
+            <w:tcW w:w="1944" w:type="dxa"/>
+          </w:tcPr>
+          <w:p>
+            <w:r>
+              <w:rPr>
+                <w:b/>
+              </w:rPr>
+              <w:t>AI Tools &amp; APIs:</w:t>
+            </w:r>
+          </w:p>
+        </w:tc>
+        <w:tc>
+          <w:tcPr>
+            <w:tcW w:w="8856" w:type="dxa"/>
+          </w:tcPr>
+          <w:p>
+            <w:r>
+              <w:t>HuggingFace, Google Gemini, Groq (GPT-OSS), OpenCode, LangChain, LangGraph</w:t>
+            </w:r>
+          </w:p>
+        </w:tc>
+      </w:tr>
+      <w:tr>
+        <w:tc>
+          <w:tcPr>
+            <w:tcW w:w="1944" w:type="dxa"/>
+          </w:tcPr>
+          <w:p>
+            <w:r>
+              <w:rPr>
+                <w:b/>
+              </w:rPr>
+              <w:t>Frameworks:</w:t>
+            </w:r>
+          </w:p>
+        </w:tc>
+        <w:tc>
+          <w:tcPr>
+            <w:tcW w:w="8856" w:type="dxa"/>
+          </w:tcPr>
+          <w:p>
+            <w:r>
+              <w:t>FastAPI, TensorFlow/Keras, Scikit-learn, Pandas, NumPy, Streamlit, Matplotlib/Seaborn</w:t>
+            </w:r>
+          </w:p>
+        </w:tc>
+      </w:tr>
+      <w:tr>
+        <w:tc>
+          <w:tcPr>
+            <w:tcW w:w="1944" w:type="dxa"/>
+          </w:tcPr>
+          <w:p>
+            <w:r>
+              <w:rPr>
+                <w:b/>
+              </w:rPr>
+              <w:t>Databases &amp; Tools:</w:t>
+            </w:r>
+          </w:p>
+        </w:tc>
+        <w:tc>
+          <w:tcPr>
+            <w:tcW w:w="8856" w:type="dxa"/>
+          </w:tcPr>
+          <w:p>
+            <w:r>
+              <w:t>PostgreSQL, Docker, Jupyter Notebook, Google Colab, Kaggle</w:t>
+            </w:r>
+          </w:p>
+        </w:tc>
+      </w:tr>
+    </w:tbl>
     <w:p>
       <w:pPr>
         <w:pBdr>
@@ -294,7 +364,7 @@
         <w:rPr>
           <w:b w:val="0"/>
         </w:rPr>
-        <w:t>. Scoped multi-file understanding (PDF/DOCX/images) via Gemini/Groq vision. Deployed on Oracle Cloud with FastAPI, Nginx, and SSL.</w:t>
+        <w:t>. Scoped multi-file understanding (PDF/DOCX/images) via Gemini/Groq vision.</w:t>
       </w:r>
     </w:p>
     <w:p>

</xml_diff>

<commit_message>
Add clickable links to project repos/live demos
</commit_message>
<xml_diff>
--- a/Krish_Rakholiya_Resume.docx
+++ b/Krish_Rakholiya_Resume.docx
@@ -18,7 +18,7 @@
     </w:p>
     <w:p>
       <w:pPr>
-        <w:spacing w:after="54"/>
+        <w:spacing w:after="30"/>
         <w:jc w:val="center"/>
       </w:pPr>
       <w:r>
@@ -30,7 +30,7 @@
     </w:p>
     <w:p>
       <w:pPr>
-        <w:spacing w:after="54"/>
+        <w:spacing w:after="30"/>
         <w:jc w:val="center"/>
       </w:pPr>
       <w:r>
@@ -42,7 +42,7 @@
         <w:pBdr>
           <w:bottom w:val="single" w:sz="6" w:space="2" w:color="000000"/>
         </w:pBdr>
-        <w:spacing w:before="76" w:after="54"/>
+        <w:spacing w:before="50" w:after="30"/>
       </w:pPr>
       <w:r>
         <w:rPr>
@@ -56,7 +56,7 @@
     </w:p>
     <w:p>
       <w:pPr>
-        <w:spacing w:line="223" w:lineRule="auto"/>
+        <w:spacing w:line="204" w:lineRule="auto"/>
       </w:pPr>
       <w:r>
         <w:t>B.Tech AI &amp; Data Science student (2023-2027) with hands-on experience building and deploying full-stack ML systems end-to-end - data preprocessing, EDA, training, evaluation, and cloud deployment. Shipped production AI apps using FastAPI and multi-provider LLM APIs (Gemini, Groq). Seeking ML Engineer or Data Science roles.</w:t>
@@ -67,7 +67,7 @@
         <w:pBdr>
           <w:bottom w:val="single" w:sz="6" w:space="2" w:color="000000"/>
         </w:pBdr>
-        <w:spacing w:before="76" w:after="54"/>
+        <w:spacing w:before="50" w:after="30"/>
       </w:pPr>
       <w:r>
         <w:rPr>
@@ -224,7 +224,7 @@
         <w:pBdr>
           <w:bottom w:val="single" w:sz="6" w:space="2" w:color="000000"/>
         </w:pBdr>
-        <w:spacing w:before="76" w:after="54"/>
+        <w:spacing w:before="50" w:after="30"/>
       </w:pPr>
       <w:r>
         <w:rPr>
@@ -241,7 +241,7 @@
         <w:tabs>
           <w:tab w:val="right" w:pos="9360"/>
         </w:tabs>
-        <w:spacing w:before="76" w:after="54" w:line="223" w:lineRule="auto"/>
+        <w:spacing w:before="50" w:after="30" w:line="204" w:lineRule="auto"/>
       </w:pPr>
       <w:r>
         <w:rPr>
@@ -257,7 +257,7 @@
     </w:p>
     <w:p>
       <w:pPr>
-        <w:spacing w:after="54" w:line="223" w:lineRule="auto"/>
+        <w:spacing w:after="30" w:line="204" w:lineRule="auto"/>
       </w:pPr>
       <w:r>
         <w:rPr>
@@ -274,7 +274,7 @@
           <w:ilvl w:val="0"/>
           <w:numId w:val="2"/>
         </w:numPr>
-        <w:spacing w:after="54" w:line="223" w:lineRule="auto"/>
+        <w:spacing w:after="30" w:line="204" w:lineRule="auto"/>
       </w:pPr>
       <w:r>
         <w:t>Completed one-month virtual Data Science internship; built ML models, performed data preprocessing, EDA, and applied data science tasks on real datasets.</w:t>
@@ -287,7 +287,7 @@
           <w:ilvl w:val="0"/>
           <w:numId w:val="2"/>
         </w:numPr>
-        <w:spacing w:after="54" w:line="223" w:lineRule="auto"/>
+        <w:spacing w:after="30" w:line="204" w:lineRule="auto"/>
       </w:pPr>
       <w:r>
         <w:t>Received Certificate of Completion and Letter of Recommendation from Founder &amp; CEO. Certificate ID: CA/DF1/62548</w:t>
@@ -298,7 +298,7 @@
         <w:pBdr>
           <w:bottom w:val="single" w:sz="6" w:space="2" w:color="000000"/>
         </w:pBdr>
-        <w:spacing w:before="76" w:after="54"/>
+        <w:spacing w:before="50" w:after="30"/>
       </w:pPr>
       <w:r>
         <w:rPr>
@@ -315,7 +315,7 @@
         <w:tabs>
           <w:tab w:val="right" w:pos="9360"/>
         </w:tabs>
-        <w:spacing w:before="76" w:after="54" w:line="223" w:lineRule="auto"/>
+        <w:spacing w:before="50" w:after="30" w:line="204" w:lineRule="auto"/>
       </w:pPr>
       <w:r>
         <w:rPr>
@@ -330,7 +330,7 @@
     </w:p>
     <w:p>
       <w:pPr>
-        <w:spacing w:after="54" w:line="223" w:lineRule="auto"/>
+        <w:spacing w:after="30" w:line="204" w:lineRule="auto"/>
       </w:pPr>
       <w:r>
         <w:rPr>
@@ -346,7 +346,7 @@
           <w:ilvl w:val="0"/>
           <w:numId w:val="2"/>
         </w:numPr>
-        <w:spacing w:after="54" w:line="223" w:lineRule="auto"/>
+        <w:spacing w:after="30" w:line="204" w:lineRule="auto"/>
       </w:pPr>
       <w:r>
         <w:rPr>
@@ -369,33 +369,37 @@
     </w:p>
     <w:p>
       <w:pPr>
-        <w:spacing w:after="54" w:line="223" w:lineRule="auto"/>
+        <w:spacing w:after="30" w:line="204" w:lineRule="auto"/>
       </w:pPr>
       <w:r>
         <w:t xml:space="preserve">Live at </w:t>
       </w:r>
-      <w:r>
-        <w:rPr>
-          <w:b/>
-        </w:rPr>
-        <w:t>kgpt.zrik.tech</w:t>
-      </w:r>
+      <w:hyperlink r:id="rId7">
+        <w:r>
+          <w:rPr>
+            <w:b/>
+          </w:rPr>
+          <w:t>kgpt.zrik.tech</w:t>
+        </w:r>
+      </w:hyperlink>
       <w:r>
         <w:t xml:space="preserve">  -  </w:t>
       </w:r>
-      <w:r>
-        <w:rPr>
-          <w:b/>
-        </w:rPr>
-        <w:t>github.com/krishrakholiya32/kGPT</w:t>
-      </w:r>
+      <w:hyperlink r:id="rId8">
+        <w:r>
+          <w:rPr>
+            <w:b/>
+          </w:rPr>
+          <w:t>github.com/krishrakholiya32/kGPT</w:t>
+        </w:r>
+      </w:hyperlink>
     </w:p>
     <w:p>
       <w:pPr>
         <w:tabs>
           <w:tab w:val="right" w:pos="9360"/>
         </w:tabs>
-        <w:spacing w:before="76" w:after="54" w:line="223" w:lineRule="auto"/>
+        <w:spacing w:before="50" w:after="30" w:line="204" w:lineRule="auto"/>
       </w:pPr>
       <w:r>
         <w:rPr>
@@ -410,7 +414,7 @@
     </w:p>
     <w:p>
       <w:pPr>
-        <w:spacing w:after="54" w:line="223" w:lineRule="auto"/>
+        <w:spacing w:after="30" w:line="204" w:lineRule="auto"/>
       </w:pPr>
       <w:r>
         <w:rPr>
@@ -426,7 +430,7 @@
           <w:ilvl w:val="0"/>
           <w:numId w:val="2"/>
         </w:numPr>
-        <w:spacing w:after="54" w:line="223" w:lineRule="auto"/>
+        <w:spacing w:after="30" w:line="204" w:lineRule="auto"/>
       </w:pPr>
       <w:r>
         <w:rPr>
@@ -449,33 +453,37 @@
     </w:p>
     <w:p>
       <w:pPr>
-        <w:spacing w:after="54" w:line="223" w:lineRule="auto"/>
+        <w:spacing w:after="30" w:line="204" w:lineRule="auto"/>
       </w:pPr>
       <w:r>
         <w:t xml:space="preserve">Live at </w:t>
       </w:r>
-      <w:r>
-        <w:rPr>
-          <w:b/>
-        </w:rPr>
-        <w:t>pptgen.zrik.tech</w:t>
-      </w:r>
+      <w:hyperlink r:id="rId9">
+        <w:r>
+          <w:rPr>
+            <w:b/>
+          </w:rPr>
+          <w:t>pptgen.zrik.tech</w:t>
+        </w:r>
+      </w:hyperlink>
       <w:r>
         <w:t xml:space="preserve">  -  </w:t>
       </w:r>
-      <w:r>
-        <w:rPr>
-          <w:b/>
-        </w:rPr>
-        <w:t>github.com/krishrakholiya32/PptGen</w:t>
-      </w:r>
+      <w:hyperlink r:id="rId10">
+        <w:r>
+          <w:rPr>
+            <w:b/>
+          </w:rPr>
+          <w:t>github.com/krishrakholiya32/PptGen</w:t>
+        </w:r>
+      </w:hyperlink>
     </w:p>
     <w:p>
       <w:pPr>
         <w:tabs>
           <w:tab w:val="right" w:pos="9360"/>
         </w:tabs>
-        <w:spacing w:before="76" w:after="54" w:line="223" w:lineRule="auto"/>
+        <w:spacing w:before="50" w:after="30" w:line="204" w:lineRule="auto"/>
       </w:pPr>
       <w:r>
         <w:rPr>
@@ -490,7 +498,7 @@
     </w:p>
     <w:p>
       <w:pPr>
-        <w:spacing w:after="54" w:line="223" w:lineRule="auto"/>
+        <w:spacing w:after="30" w:line="204" w:lineRule="auto"/>
       </w:pPr>
       <w:r>
         <w:rPr>
@@ -506,7 +514,7 @@
           <w:ilvl w:val="0"/>
           <w:numId w:val="2"/>
         </w:numPr>
-        <w:spacing w:after="54" w:line="223" w:lineRule="auto"/>
+        <w:spacing w:after="30" w:line="204" w:lineRule="auto"/>
       </w:pPr>
       <w:r>
         <w:rPr>
@@ -553,33 +561,145 @@
     </w:p>
     <w:p>
       <w:pPr>
-        <w:spacing w:after="54" w:line="223" w:lineRule="auto"/>
+        <w:spacing w:after="30" w:line="204" w:lineRule="auto"/>
       </w:pPr>
       <w:r>
         <w:t xml:space="preserve">Live at </w:t>
       </w:r>
-      <w:r>
-        <w:rPr>
-          <w:b/>
-        </w:rPr>
-        <w:t>caresale.zrik.tech</w:t>
-      </w:r>
+      <w:hyperlink r:id="rId11">
+        <w:r>
+          <w:rPr>
+            <w:b/>
+          </w:rPr>
+          <w:t>caresale.zrik.tech</w:t>
+        </w:r>
+      </w:hyperlink>
       <w:r>
         <w:t xml:space="preserve">  -  </w:t>
       </w:r>
-      <w:r>
-        <w:rPr>
-          <w:b/>
-        </w:rPr>
-        <w:t>github.com/krishrakholiya32/CaReSale</w:t>
-      </w:r>
+      <w:hyperlink r:id="rId12">
+        <w:r>
+          <w:rPr>
+            <w:b/>
+          </w:rPr>
+          <w:t>github.com/krishrakholiya32/CaReSale</w:t>
+        </w:r>
+      </w:hyperlink>
+    </w:p>
+    <w:p>
+      <w:pPr>
+        <w:tabs>
+          <w:tab w:val="right" w:pos="9360"/>
+        </w:tabs>
+        <w:spacing w:before="50" w:after="30" w:line="204" w:lineRule="auto"/>
+      </w:pPr>
+      <w:r>
+        <w:rPr>
+          <w:b/>
+        </w:rPr>
+        <w:t>ResuMatch - Resume/JD Fit Scorer</w:t>
+      </w:r>
+      <w:r>
+        <w:tab/>
+        <w:t>Jul 2026</w:t>
+      </w:r>
+    </w:p>
+    <w:p>
+      <w:pPr>
+        <w:spacing w:after="30" w:line="204" w:lineRule="auto"/>
+      </w:pPr>
+      <w:r>
+        <w:rPr>
+          <w:i/>
+        </w:rPr>
+        <w:t>Python, DistilBERT, Hugging Face Transformers, ONNX Runtime, Streamlit</w:t>
+      </w:r>
+    </w:p>
+    <w:p>
+      <w:pPr>
+        <w:pStyle w:val="ListParagraph"/>
+        <w:numPr>
+          <w:ilvl w:val="0"/>
+          <w:numId w:val="2"/>
+        </w:numPr>
+        <w:spacing w:after="30" w:line="204" w:lineRule="auto"/>
+      </w:pPr>
+      <w:r>
+        <w:rPr>
+          <w:b w:val="0"/>
+        </w:rPr>
+        <w:t xml:space="preserve">Self-trained DistilBERT classifier fine-tuned on </w:t>
+      </w:r>
+      <w:r>
+        <w:rPr>
+          <w:b/>
+        </w:rPr>
+        <w:t>8,000</w:t>
+      </w:r>
+      <w:r>
+        <w:rPr>
+          <w:b w:val="0"/>
+        </w:rPr>
+        <w:t xml:space="preserve"> real resume-JD pairs for 3-class fit scoring (</w:t>
+      </w:r>
+      <w:r>
+        <w:rPr>
+          <w:b/>
+        </w:rPr>
+        <w:t>Test macro-F1 0.410</w:t>
+      </w:r>
+      <w:r>
+        <w:rPr>
+          <w:b w:val="0"/>
+        </w:rPr>
+        <w:t xml:space="preserve">); full-document chunking bypasses the 512-token limit, and low-confidence predictions are flagged instead of shown as false certainty. Found and fixed a </w:t>
+      </w:r>
+      <w:r>
+        <w:rPr>
+          <w:b/>
+        </w:rPr>
+        <w:t>data-leakage flaw</w:t>
+      </w:r>
+      <w:r>
+        <w:rPr>
+          <w:b w:val="0"/>
+        </w:rPr>
+        <w:t xml:space="preserve"> in the validation split (initial score was inflated 74%), retraining with a corrected group-based split to reach this honest, properly-validated result.</w:t>
+      </w:r>
+    </w:p>
+    <w:p>
+      <w:pPr>
+        <w:spacing w:after="30" w:line="204" w:lineRule="auto"/>
+      </w:pPr>
+      <w:r>
+        <w:t xml:space="preserve">Live at </w:t>
+      </w:r>
+      <w:hyperlink r:id="rId13">
+        <w:r>
+          <w:rPr>
+            <w:b/>
+          </w:rPr>
+          <w:t>resumatch-zrik.streamlit.app</w:t>
+        </w:r>
+      </w:hyperlink>
+      <w:r>
+        <w:t xml:space="preserve">  -  </w:t>
+      </w:r>
+      <w:hyperlink r:id="rId14">
+        <w:r>
+          <w:rPr>
+            <w:b/>
+          </w:rPr>
+          <w:t>github.com/krishrakholiya32/ResuMatch</w:t>
+        </w:r>
+      </w:hyperlink>
     </w:p>
     <w:p>
       <w:pPr>
         <w:pBdr>
           <w:bottom w:val="single" w:sz="6" w:space="2" w:color="000000"/>
         </w:pBdr>
-        <w:spacing w:before="76" w:after="54"/>
+        <w:spacing w:before="50" w:after="30"/>
       </w:pPr>
       <w:r>
         <w:rPr>
@@ -596,7 +716,7 @@
         <w:tabs>
           <w:tab w:val="right" w:pos="9360"/>
         </w:tabs>
-        <w:spacing w:before="76" w:after="54" w:line="223" w:lineRule="auto"/>
+        <w:spacing w:before="50" w:after="30" w:line="204" w:lineRule="auto"/>
       </w:pPr>
       <w:r>
         <w:t>B.Tech - Artificial Intelligence &amp; Data Science</w:t>
@@ -608,7 +728,7 @@
     </w:p>
     <w:p>
       <w:pPr>
-        <w:spacing w:line="223" w:lineRule="auto"/>
+        <w:spacing w:line="204" w:lineRule="auto"/>
       </w:pPr>
       <w:r>
         <w:t>A.D. Patel Institute of Technology, CVM University, Anand | CGPA: 8.59 (6th Sem)</w:t>
@@ -619,7 +739,7 @@
         <w:tabs>
           <w:tab w:val="right" w:pos="9360"/>
         </w:tabs>
-        <w:spacing w:after="54" w:line="223" w:lineRule="auto"/>
+        <w:spacing w:after="30" w:line="204" w:lineRule="auto"/>
       </w:pPr>
       <w:r>
         <w:t>HSC (12th) - Sanskartirth Gyanpeeth, Surat | 70%</w:t>
@@ -634,7 +754,7 @@
         <w:tabs>
           <w:tab w:val="right" w:pos="9360"/>
         </w:tabs>
-        <w:spacing w:after="54" w:line="223" w:lineRule="auto"/>
+        <w:spacing w:after="30" w:line="204" w:lineRule="auto"/>
       </w:pPr>
       <w:r>
         <w:t>SSC (10th) - Sanskartirth Gyanpeeth, Surat | 88%</w:t>
@@ -649,7 +769,7 @@
         <w:pBdr>
           <w:bottom w:val="single" w:sz="6" w:space="2" w:color="000000"/>
         </w:pBdr>
-        <w:spacing w:before="76" w:after="54"/>
+        <w:spacing w:before="50" w:after="30"/>
       </w:pPr>
       <w:r>
         <w:rPr>
@@ -666,7 +786,7 @@
         <w:tabs>
           <w:tab w:val="right" w:pos="9360"/>
         </w:tabs>
-        <w:spacing w:line="223" w:lineRule="auto"/>
+        <w:spacing w:line="204" w:lineRule="auto"/>
       </w:pPr>
       <w:r>
         <w:t>Google Foundations: Data, Data, Everywhere (Coursera)</w:t>
@@ -681,7 +801,7 @@
         <w:tabs>
           <w:tab w:val="right" w:pos="9360"/>
         </w:tabs>
-        <w:spacing w:line="223" w:lineRule="auto"/>
+        <w:spacing w:line="204" w:lineRule="auto"/>
       </w:pPr>
       <w:r>
         <w:t>Applied Robotics from Concept to Creation</w:t>
@@ -696,7 +816,7 @@
         <w:tabs>
           <w:tab w:val="right" w:pos="9360"/>
         </w:tabs>
-        <w:spacing w:line="223" w:lineRule="auto"/>
+        <w:spacing w:line="204" w:lineRule="auto"/>
       </w:pPr>
       <w:r>
         <w:t>Smart India Hackathon SIH-2025 Participant</w:t>
@@ -711,7 +831,7 @@
         <w:tabs>
           <w:tab w:val="right" w:pos="9360"/>
         </w:tabs>
-        <w:spacing w:line="223" w:lineRule="auto"/>
+        <w:spacing w:line="204" w:lineRule="auto"/>
       </w:pPr>
       <w:r>
         <w:t>CodeAlpha DS Internship - Certificate + LoR</w:t>
@@ -723,7 +843,7 @@
     </w:p>
     <w:sectPr>
       <w:pgSz w:w="12240" w:h="15840"/>
-      <w:pgMar w:top="605" w:right="750" w:bottom="605" w:left="750" w:header="708" w:footer="708" w:gutter="0"/>
+      <w:pgMar w:top="432" w:right="750" w:bottom="432" w:left="750" w:header="708" w:footer="708" w:gutter="0"/>
       <w:cols w:space="720"/>
       <w:docGrid w:linePitch="360"/>
     </w:sectPr>

</xml_diff>

<commit_message>
Remove redundant header tagline
</commit_message>
<xml_diff>
--- a/Krish_Rakholiya_Resume.docx
+++ b/Krish_Rakholiya_Resume.docx
@@ -14,18 +14,6 @@
           <w:szCs w:val="32"/>
         </w:rPr>
         <w:t>KRISH RAKHOLIYA</w:t>
-      </w:r>
-    </w:p>
-    <w:p>
-      <w:pPr>
-        <w:spacing w:after="30"/>
-        <w:jc w:val="center"/>
-      </w:pPr>
-      <w:r>
-        <w:t xml:space="preserve">ML Engineer | LLM Engineering | Generative AI | Machine Learning | Deep Learning | </w:t>
-      </w:r>
-      <w:r>
-        <w:t>FastAPI</w:t>
       </w:r>
     </w:p>
     <w:p>

</xml_diff>

<commit_message>
Right-align location on contact line, tighten spacing before Summary
</commit_message>
<xml_diff>
--- a/Krish_Rakholiya_Resume.docx
+++ b/Krish_Rakholiya_Resume.docx
@@ -18,11 +18,15 @@
     </w:p>
     <w:p>
       <w:pPr>
-        <w:spacing w:after="30"/>
-        <w:jc w:val="center"/>
-      </w:pPr>
-      <w:r>
-        <w:t>krishrakholiya32@gmail.com | +91 63543 49464 | Surat, Gujarat | github.com/krishrakholiya32 | linkedin.com/in/krishrakholiya32</w:t>
+        <w:tabs>
+          <w:tab w:pos="10740" w:val="right"/>
+        </w:tabs>
+        <w:spacing w:after="120"/>
+      </w:pPr>
+      <w:r>
+        <w:t>krishrakholiya32@gmail.com | +91 63543 49464 | github.com/krishrakholiya32 | linkedin.com/in/krishrakholiya32</w:t>
+        <w:tab/>
+        <w:t>Surat, Gujarat</w:t>
       </w:r>
     </w:p>
     <w:p>

</xml_diff>

<commit_message>
Trim ResuMatch bullet, drop the data-leakage sentence
</commit_message>
<xml_diff>
--- a/Krish_Rakholiya_Resume.docx
+++ b/Krish_Rakholiya_Resume.docx
@@ -644,19 +644,7 @@
         <w:rPr>
           <w:b w:val="0"/>
         </w:rPr>
-        <w:t xml:space="preserve">); full-document chunking bypasses the 512-token limit, and low-confidence predictions are flagged instead of shown as false certainty. Found and fixed a </w:t>
-      </w:r>
-      <w:r>
-        <w:rPr>
-          <w:b/>
-        </w:rPr>
-        <w:t>data-leakage flaw</w:t>
-      </w:r>
-      <w:r>
-        <w:rPr>
-          <w:b w:val="0"/>
-        </w:rPr>
-        <w:t xml:space="preserve"> in the validation split (initial score was inflated 74%), retraining with a corrected group-based split to reach this honest, properly-validated result.</w:t>
+        <w:t>); full-document chunking bypasses the 512-token limit, and low-confidence predictions are flagged instead of shown as false certainty.</w:t>
       </w:r>
     </w:p>
     <w:p>

</xml_diff>

<commit_message>
Swap ResuMatch metric to 66% no-fit precision
</commit_message>
<xml_diff>
--- a/Krish_Rakholiya_Resume.docx
+++ b/Krish_Rakholiya_Resume.docx
@@ -638,13 +638,13 @@
         <w:rPr>
           <w:b/>
         </w:rPr>
-        <w:t>Test macro-F1 0.410</w:t>
+        <w:t>66% precision</w:t>
       </w:r>
       <w:r>
         <w:rPr>
           <w:b w:val="0"/>
         </w:rPr>
-        <w:t>); full-document chunking bypasses the 512-token limit, and low-confidence predictions are flagged instead of shown as false certainty.</w:t>
+        <w:t xml:space="preserve"> flagging clear non-matches); full-document chunking bypasses the 512-token limit, and low-confidence predictions are flagged instead of shown as false certainty.</w:t>
       </w:r>
     </w:p>
     <w:p>

</xml_diff>

<commit_message>
Equalize contact-line spacing, drop right-tab hack
</commit_message>
<xml_diff>
--- a/Krish_Rakholiya_Resume.docx
+++ b/Krish_Rakholiya_Resume.docx
@@ -18,15 +18,11 @@
     </w:p>
     <w:p>
       <w:pPr>
-        <w:tabs>
-          <w:tab w:pos="10740" w:val="right"/>
-        </w:tabs>
         <w:spacing w:after="120"/>
-      </w:pPr>
-      <w:r>
-        <w:t>krishrakholiya32@gmail.com | +91 63543 49464 | github.com/krishrakholiya32 | linkedin.com/in/krishrakholiya32 |</w:t>
-        <w:tab/>
-        <w:t>Surat, Gujarat</w:t>
+        <w:jc w:val="center"/>
+      </w:pPr>
+      <w:r>
+        <w:t>krishrakholiya32@gmail.com | +91 63543 49464 | github.com/krishrakholiya32 | linkedin.com/in/krishrakholiya32 | Surat, Gujarat</w:t>
       </w:r>
     </w:p>
     <w:p>

</xml_diff>

<commit_message>
Update skills: drop time series forecasting, PostgreSQL; reorder LLMs; move OpenCode to Tools
Co-Authored-By: Claude Sonnet 5 <noreply@anthropic.com>
</commit_message>
<xml_diff>
--- a/Krish_Rakholiya_Resume.docx
+++ b/Krish_Rakholiya_Resume.docx
@@ -126,7 +126,7 @@
           </w:tcPr>
           <w:p>
             <w:r>
-              <w:t>Machine Learning, Deep Learning, NLP, CNN, LSTM/GRU, GANs, Stable Diffusion, Transfer Learning, Unsupervised Learning, Time Series Forecasting, LLMs</w:t>
+              <w:t>Machine Learning, Deep Learning, NLP, CNN, LSTM/GRU, GANs, Stable Diffusion, LLMs, Transfer Learning, Unsupervised Learning</w:t>
             </w:r>
           </w:p>
         </w:tc>
@@ -151,7 +151,7 @@
           </w:tcPr>
           <w:p>
             <w:r>
-              <w:t>HuggingFace, Multi-Provider LLM APIs (Gemini, Groq), OpenCode, LangChain, LangGraph</w:t>
+              <w:t>HuggingFace, Multi-Provider LLM APIs (Gemini, Groq), LangChain, LangGraph</w:t>
             </w:r>
           </w:p>
         </w:tc>
@@ -191,7 +191,7 @@
               <w:rPr>
                 <w:b/>
               </w:rPr>
-              <w:t>Databases &amp; Tools:</w:t>
+              <w:t>Tools:</w:t>
             </w:r>
           </w:p>
         </w:tc>
@@ -201,7 +201,7 @@
           </w:tcPr>
           <w:p>
             <w:r>
-              <w:t>PostgreSQL, Docker, Jupyter Notebook, Google Colab, Kaggle</w:t>
+              <w:t>Docker, Jupyter Notebook, Google Colab, Kaggle, OpenCode</w:t>
             </w:r>
           </w:p>
         </w:tc>

</xml_diff>

<commit_message>
kGPT stack line: name Gemini model (Flash Lite), drop vision mention from bullet
Co-Authored-By: Claude Sonnet 5 <noreply@anthropic.com>
</commit_message>
<xml_diff>
--- a/Krish_Rakholiya_Resume.docx
+++ b/Krish_Rakholiya_Resume.docx
@@ -324,7 +324,7 @@
         <w:rPr>
           <w:i/>
         </w:rPr>
-        <w:t>Python, Gemini + Groq (GPT-OSS-120B), FastAPI, pgvector, HuggingFace, LangGraph</w:t>
+        <w:t>Python, Gemini (Flash Lite) + Groq (GPT-OSS-120B), FastAPI, pgvector, HuggingFace, LangGraph</w:t>
       </w:r>
     </w:p>
     <w:p>
@@ -352,7 +352,7 @@
         <w:rPr>
           <w:b w:val="0"/>
         </w:rPr>
-        <w:t>. Scoped multi-file understanding (PDF/DOCX/images) via Gemini/Groq vision.</w:t>
+        <w:t>. Scoped multi-file understanding (PDF/DOCX/images).</w:t>
       </w:r>
     </w:p>
     <w:p>

</xml_diff>

<commit_message>
ResuMatch: swap Transformers for TensorFlow/Keras, fix stale 3-class numbers
Reflects the actual retrained pipeline (KerasHub, custom training loop) --
transformers is now only a tokenizer import, TF/Keras is the real skill
exercised. Also updates the bullet's stale "3-class fit scoring (66%
precision)" to the current binary model's real 0.58 macro-F1.

Co-Authored-By: Claude Sonnet 5 <noreply@anthropic.com>
</commit_message>
<xml_diff>
--- a/Krish_Rakholiya_Resume.docx
+++ b/Krish_Rakholiya_Resume.docx
@@ -600,7 +600,7 @@
         <w:rPr>
           <w:i/>
         </w:rPr>
-        <w:t>Python, DistilBERT, Hugging Face Transformers, ONNX Runtime, Streamlit</w:t>
+        <w:t>Python, TensorFlow/Keras, DistilBERT, ONNX Runtime, Streamlit</w:t>
       </w:r>
     </w:p>
     <w:p>
@@ -628,19 +628,19 @@
         <w:rPr>
           <w:b w:val="0"/>
         </w:rPr>
-        <w:t xml:space="preserve"> real resume-JD pairs for 3-class fit scoring (</w:t>
+        <w:t xml:space="preserve"> real resume-JD pairs for binary fit scoring (</w:t>
       </w:r>
       <w:r>
         <w:rPr>
           <w:b/>
         </w:rPr>
-        <w:t>66% precision</w:t>
+        <w:t>0.58 macro-F1</w:t>
       </w:r>
       <w:r>
         <w:rPr>
           <w:b w:val="0"/>
         </w:rPr>
-        <w:t xml:space="preserve"> flagging clear non-matches); full-document chunking bypasses the 512-token limit, and low-confidence predictions are flagged instead of shown as false certainty.</w:t>
+        <w:t xml:space="preserve">, ~1.7x the majority-class baseline); full-document chunking bypasses the 512-token limit, and low-confidence predictions are flagged instead of shown as false certainty.</w:t>
       </w:r>
     </w:p>
     <w:p>

</xml_diff>

<commit_message>
Update ResuMatch bullet with cleaned-data retrain numbers (0.58 -> 0.63 macro-F1)
</commit_message>
<xml_diff>
--- a/Krish_Rakholiya_Resume.docx
+++ b/Krish_Rakholiya_Resume.docx
@@ -1,5 +1,53 @@
 
-<file path=word/document.xml><?xml version="1.0" encoding="utf-8"?>
+<file path=docProps\app.xml><?xml version="1.0" encoding="utf-8"?>
+<Properties xmlns="http://schemas.openxmlformats.org/officeDocument/2006/extended-properties" xmlns:vt="http://schemas.openxmlformats.org/officeDocument/2006/docPropsVTypes">
+  <Template>Normal.dotm</Template>
+  <TotalTime>15</TotalTime>
+  <Pages>1</Pages>
+  <Words>642</Words>
+  <Characters>4187</Characters>
+  <Application>Microsoft Office Word</Application>
+  <DocSecurity>0</DocSecurity>
+  <Lines>67</Lines>
+  <Paragraphs>48</Paragraphs>
+  <ScaleCrop>false</ScaleCrop>
+  <HeadingPairs>
+    <vt:vector size="2" baseType="variant">
+      <vt:variant>
+        <vt:lpstr>Title</vt:lpstr>
+      </vt:variant>
+      <vt:variant>
+        <vt:i4>1</vt:i4>
+      </vt:variant>
+    </vt:vector>
+  </HeadingPairs>
+  <TitlesOfParts>
+    <vt:vector size="1" baseType="lpstr">
+      <vt:lpstr>Resume - Krish Rakholiya</vt:lpstr>
+    </vt:vector>
+  </TitlesOfParts>
+  <Company/>
+  <LinksUpToDate>false</LinksUpToDate>
+  <CharactersWithSpaces>4796</CharactersWithSpaces>
+  <SharedDoc>false</SharedDoc>
+  <HyperlinksChanged>false</HyperlinksChanged>
+  <AppVersion>16.0000</AppVersion>
+</Properties>
+</file>
+
+<file path=docProps\core.xml><?xml version="1.0" encoding="utf-8"?>
+<cp:coreProperties xmlns:cp="http://schemas.openxmlformats.org/package/2006/metadata/core-properties" xmlns:dc="http://purl.org/dc/elements/1.1/" xmlns:dcterms="http://purl.org/dc/terms/" xmlns:dcmitype="http://purl.org/dc/dcmitype/" xmlns:xsi="http://www.w3.org/2001/XMLSchema-instance">
+  <dc:title>Resume - Krish Rakholiya</dc:title>
+  <dc:creator>Krish Rakholiya</dc:creator>
+  <cp:lastModifiedBy>Krish Rakholiya</cp:lastModifiedBy>
+  <cp:revision>33</cp:revision>
+  <cp:lastPrinted>2026-07-12T07:01:00Z</cp:lastPrinted>
+  <dcterms:created xsi:type="dcterms:W3CDTF">2026-07-01T07:28:00Z</dcterms:created>
+  <dcterms:modified xsi:type="dcterms:W3CDTF">2026-07-12T07:01:00Z</dcterms:modified>
+</cp:coreProperties>
+</file>
+
+<file path=word\document.xml><?xml version="1.0" encoding="utf-8"?>
 <w:document xmlns:wpc="http://schemas.microsoft.com/office/word/2010/wordprocessingCanvas" xmlns:cx="http://schemas.microsoft.com/office/drawing/2014/chartex" xmlns:cx1="http://schemas.microsoft.com/office/drawing/2015/9/8/chartex" xmlns:cx2="http://schemas.microsoft.com/office/drawing/2015/10/21/chartex" xmlns:cx3="http://schemas.microsoft.com/office/drawing/2016/5/9/chartex" xmlns:cx4="http://schemas.microsoft.com/office/drawing/2016/5/10/chartex" xmlns:cx5="http://schemas.microsoft.com/office/drawing/2016/5/11/chartex" xmlns:cx6="http://schemas.microsoft.com/office/drawing/2016/5/12/chartex" xmlns:cx7="http://schemas.microsoft.com/office/drawing/2016/5/13/chartex" xmlns:cx8="http://schemas.microsoft.com/office/drawing/2016/5/14/chartex" xmlns:mc="http://schemas.openxmlformats.org/markup-compatibility/2006" xmlns:aink="http://schemas.microsoft.com/office/drawing/2016/ink" xmlns:am3d="http://schemas.microsoft.com/office/drawing/2017/model3d" xmlns:o="urn:schemas-microsoft-com:office:office" xmlns:oel="http://schemas.microsoft.com/office/2019/extlst" xmlns:r="http://schemas.openxmlformats.org/officeDocument/2006/relationships" xmlns:m="http://schemas.openxmlformats.org/officeDocument/2006/math" xmlns:v="urn:schemas-microsoft-com:vml" xmlns:wp14="http://schemas.microsoft.com/office/word/2010/wordprocessingDrawing" xmlns:wp="http://schemas.openxmlformats.org/drawingml/2006/wordprocessingDrawing" xmlns:w10="urn:schemas-microsoft-com:office:word" xmlns:w="http://schemas.openxmlformats.org/wordprocessingml/2006/main" xmlns:w14="http://schemas.microsoft.com/office/word/2010/wordml" xmlns:w15="http://schemas.microsoft.com/office/word/2012/wordml" xmlns:w16cex="http://schemas.microsoft.com/office/word/2018/wordml/cex" xmlns:w16cid="http://schemas.microsoft.com/office/word/2016/wordml/cid" xmlns:w16="http://schemas.microsoft.com/office/word/2018/wordml" xmlns:w16du="http://schemas.microsoft.com/office/word/2023/wordml/word16du" xmlns:w16sdtdh="http://schemas.microsoft.com/office/word/2020/wordml/sdtdatahash" xmlns:w16sdtfl="http://schemas.microsoft.com/office/word/2024/wordml/sdtformatlock" xmlns:w16se="http://schemas.microsoft.com/office/word/2015/wordml/symex" xmlns:wpg="http://schemas.microsoft.com/office/word/2010/wordprocessingGroup" xmlns:wpi="http://schemas.microsoft.com/office/word/2010/wordprocessingInk" xmlns:wne="http://schemas.microsoft.com/office/word/2006/wordml" xmlns:wps="http://schemas.microsoft.com/office/word/2010/wordprocessingShape" mc:Ignorable="w14 w15 w16se w16cid w16 w16cex w16sdtdh w16sdtfl w16du wp14">
   <w:body>
     <w:p>
@@ -538,7 +586,7 @@
         <w:rPr>
           <w:b/>
         </w:rPr>
-        <w:t>Test R² 0.905</w:t>
+        <w:t>Test RÂ² 0.905</w:t>
       </w:r>
       <w:r>
         <w:rPr>
@@ -634,13 +682,13 @@
         <w:rPr>
           <w:b/>
         </w:rPr>
-        <w:t>0.58 macro-F1</w:t>
+        <w:t>0.63 macro-F1</w:t>
       </w:r>
       <w:r>
         <w:rPr>
           <w:b w:val="0"/>
         </w:rPr>
-        <w:t xml:space="preserve">, ~1.7x the majority-class baseline); full-document chunking bypasses the 512-token limit, and low-confidence predictions are flagged instead of shown as false certainty.</w:t>
+        <w:t xml:space="preserve">, ~1.9x the majority-class baseline); full-document chunking bypasses the 512-token limit, and low-confidence predictions are flagged instead of shown as false certainty.</w:t>
       </w:r>
     </w:p>
     <w:p>
@@ -827,7 +875,33 @@
 </w:document>
 </file>
 
-<file path=word/numbering.xml><?xml version="1.0" encoding="utf-8"?>
+<file path=word\fontTable.xml><?xml version="1.0" encoding="utf-8"?>
+<w:fonts xmlns:mc="http://schemas.openxmlformats.org/markup-compatibility/2006" xmlns:r="http://schemas.openxmlformats.org/officeDocument/2006/relationships" xmlns:w="http://schemas.openxmlformats.org/wordprocessingml/2006/main" xmlns:w14="http://schemas.microsoft.com/office/word/2010/wordml" xmlns:w15="http://schemas.microsoft.com/office/word/2012/wordml" xmlns:w16cex="http://schemas.microsoft.com/office/word/2018/wordml/cex" xmlns:w16cid="http://schemas.microsoft.com/office/word/2016/wordml/cid" xmlns:w16="http://schemas.microsoft.com/office/word/2018/wordml" xmlns:w16du="http://schemas.microsoft.com/office/word/2023/wordml/word16du" xmlns:w16sdtdh="http://schemas.microsoft.com/office/word/2020/wordml/sdtdatahash" xmlns:w16sdtfl="http://schemas.microsoft.com/office/word/2024/wordml/sdtformatlock" xmlns:w16se="http://schemas.microsoft.com/office/word/2015/wordml/symex" mc:Ignorable="w14 w15 w16se w16cid w16 w16cex w16sdtdh w16sdtfl w16du">
+  <w:font w:name="Calibri">
+    <w:panose1 w:val="020F0502020204030204"/>
+    <w:charset w:val="00"/>
+    <w:family w:val="swiss"/>
+    <w:pitch w:val="variable"/>
+    <w:sig w:usb0="E4002EFF" w:usb1="C200247B" w:usb2="00000009" w:usb3="00000000" w:csb0="000001FF" w:csb1="00000000"/>
+  </w:font>
+  <w:font w:name="Times New Roman">
+    <w:panose1 w:val="02020603050405020304"/>
+    <w:charset w:val="00"/>
+    <w:family w:val="roman"/>
+    <w:pitch w:val="variable"/>
+    <w:sig w:usb0="E0002EFF" w:usb1="C000785B" w:usb2="00000009" w:usb3="00000000" w:csb0="000001FF" w:csb1="00000000"/>
+  </w:font>
+  <w:font w:name="Calibri Light">
+    <w:panose1 w:val="020F0302020204030204"/>
+    <w:charset w:val="00"/>
+    <w:family w:val="swiss"/>
+    <w:pitch w:val="variable"/>
+    <w:sig w:usb0="E4002EFF" w:usb1="C200247B" w:usb2="00000009" w:usb3="00000000" w:csb0="000001FF" w:csb1="00000000"/>
+  </w:font>
+</w:fonts>
+</file>
+
+<file path=word\numbering.xml><?xml version="1.0" encoding="utf-8"?>
 <w:numbering xmlns:wpc="http://schemas.microsoft.com/office/word/2010/wordprocessingCanvas" xmlns:cx="http://schemas.microsoft.com/office/drawing/2014/chartex" xmlns:cx1="http://schemas.microsoft.com/office/drawing/2015/9/8/chartex" xmlns:cx2="http://schemas.microsoft.com/office/drawing/2015/10/21/chartex" xmlns:cx3="http://schemas.microsoft.com/office/drawing/2016/5/9/chartex" xmlns:cx4="http://schemas.microsoft.com/office/drawing/2016/5/10/chartex" xmlns:cx5="http://schemas.microsoft.com/office/drawing/2016/5/11/chartex" xmlns:cx6="http://schemas.microsoft.com/office/drawing/2016/5/12/chartex" xmlns:cx7="http://schemas.microsoft.com/office/drawing/2016/5/13/chartex" xmlns:cx8="http://schemas.microsoft.com/office/drawing/2016/5/14/chartex" xmlns:mc="http://schemas.openxmlformats.org/markup-compatibility/2006" xmlns:aink="http://schemas.microsoft.com/office/drawing/2016/ink" xmlns:am3d="http://schemas.microsoft.com/office/drawing/2017/model3d" xmlns:o="urn:schemas-microsoft-com:office:office" xmlns:oel="http://schemas.microsoft.com/office/2019/extlst" xmlns:r="http://schemas.openxmlformats.org/officeDocument/2006/relationships" xmlns:m="http://schemas.openxmlformats.org/officeDocument/2006/math" xmlns:v="urn:schemas-microsoft-com:vml" xmlns:wp14="http://schemas.microsoft.com/office/word/2010/wordprocessingDrawing" xmlns:wp="http://schemas.openxmlformats.org/drawingml/2006/wordprocessingDrawing" xmlns:w10="urn:schemas-microsoft-com:office:word" xmlns:w="http://schemas.openxmlformats.org/wordprocessingml/2006/main" xmlns:w14="http://schemas.microsoft.com/office/word/2010/wordml" xmlns:w15="http://schemas.microsoft.com/office/word/2012/wordml" xmlns:w16cex="http://schemas.microsoft.com/office/word/2018/wordml/cex" xmlns:w16cid="http://schemas.microsoft.com/office/word/2016/wordml/cid" xmlns:w16="http://schemas.microsoft.com/office/word/2018/wordml" xmlns:w16du="http://schemas.microsoft.com/office/word/2023/wordml/word16du" xmlns:w16sdtdh="http://schemas.microsoft.com/office/word/2020/wordml/sdtdatahash" xmlns:w16sdtfl="http://schemas.microsoft.com/office/word/2024/wordml/sdtformatlock" xmlns:w16se="http://schemas.microsoft.com/office/word/2015/wordml/symex" xmlns:wpg="http://schemas.microsoft.com/office/word/2010/wordprocessingGroup" xmlns:wpi="http://schemas.microsoft.com/office/word/2010/wordprocessingInk" xmlns:wne="http://schemas.microsoft.com/office/word/2006/wordml" xmlns:wps="http://schemas.microsoft.com/office/word/2010/wordprocessingShape" mc:Ignorable="w14 w15 w16se w16cid w16 w16cex w16sdtdh w16sdtfl w16du wp14">
   <w:abstractNum w:abstractNumId="0" w15:restartNumberingAfterBreak="0">
     <w:nsid w:val="1A3E7C89"/>
@@ -984,7 +1058,120 @@
 </w:numbering>
 </file>
 
-<file path=word/styles.xml><?xml version="1.0" encoding="utf-8"?>
+<file path=word\settings.xml><?xml version="1.0" encoding="utf-8"?>
+<w:settings xmlns:mc="http://schemas.openxmlformats.org/markup-compatibility/2006" xmlns:o="urn:schemas-microsoft-com:office:office" xmlns:r="http://schemas.openxmlformats.org/officeDocument/2006/relationships" xmlns:m="http://schemas.openxmlformats.org/officeDocument/2006/math" xmlns:v="urn:schemas-microsoft-com:vml" xmlns:w10="urn:schemas-microsoft-com:office:word" xmlns:w="http://schemas.openxmlformats.org/wordprocessingml/2006/main" xmlns:w14="http://schemas.microsoft.com/office/word/2010/wordml" xmlns:w15="http://schemas.microsoft.com/office/word/2012/wordml" xmlns:w16cex="http://schemas.microsoft.com/office/word/2018/wordml/cex" xmlns:w16cid="http://schemas.microsoft.com/office/word/2016/wordml/cid" xmlns:w16="http://schemas.microsoft.com/office/word/2018/wordml" xmlns:w16du="http://schemas.microsoft.com/office/word/2023/wordml/word16du" xmlns:w16sdtdh="http://schemas.microsoft.com/office/word/2020/wordml/sdtdatahash" xmlns:w16sdtfl="http://schemas.microsoft.com/office/word/2024/wordml/sdtformatlock" xmlns:w16se="http://schemas.microsoft.com/office/word/2015/wordml/symex" xmlns:sl="http://schemas.openxmlformats.org/schemaLibrary/2006/main" mc:Ignorable="w14 w15 w16se w16cid w16 w16cex w16sdtdh w16sdtfl w16du">
+  <w:zoom w:percent="163"/>
+  <w:displayBackgroundShape/>
+  <w:defaultTabStop w:val="720"/>
+  <w:characterSpacingControl w:val="doNotCompress"/>
+  <w:compat>
+    <w:compatSetting w:name="compatibilityMode" w:uri="http://schemas.microsoft.com/office/word" w:val="15"/>
+    <w:compatSetting w:name="overrideTableStyleFontSizeAndJustification" w:uri="http://schemas.microsoft.com/office/word" w:val="1"/>
+    <w:compatSetting w:name="enableOpenTypeFeatures" w:uri="http://schemas.microsoft.com/office/word" w:val="1"/>
+    <w:compatSetting w:name="doNotFlipMirrorIndents" w:uri="http://schemas.microsoft.com/office/word" w:val="1"/>
+    <w:compatSetting w:name="differentiateMultirowTableHeaders" w:uri="http://schemas.microsoft.com/office/word" w:val="1"/>
+    <w:compatSetting w:name="useWord2013TrackBottomHyphenation" w:uri="http://schemas.microsoft.com/office/word" w:val="1"/>
+  </w:compat>
+  <w:rsids>
+    <w:rsidRoot w:val="008152D4"/>
+    <w:rsid w:val="00112A12"/>
+    <w:rsid w:val="001B5447"/>
+    <w:rsid w:val="001B7F7C"/>
+    <w:rsid w:val="00211489"/>
+    <w:rsid w:val="0022216F"/>
+    <w:rsid w:val="002E67AC"/>
+    <w:rsid w:val="00311DFD"/>
+    <w:rsid w:val="003267EA"/>
+    <w:rsid w:val="00360D98"/>
+    <w:rsid w:val="00380CBA"/>
+    <w:rsid w:val="0038648D"/>
+    <w:rsid w:val="003C715D"/>
+    <w:rsid w:val="0043722C"/>
+    <w:rsid w:val="00482449"/>
+    <w:rsid w:val="004B6EFF"/>
+    <w:rsid w:val="004F0F7E"/>
+    <w:rsid w:val="00505A85"/>
+    <w:rsid w:val="0054545D"/>
+    <w:rsid w:val="00546ED4"/>
+    <w:rsid w:val="0057787B"/>
+    <w:rsid w:val="00591722"/>
+    <w:rsid w:val="005D22BE"/>
+    <w:rsid w:val="005D3CC8"/>
+    <w:rsid w:val="005E09F6"/>
+    <w:rsid w:val="0060378D"/>
+    <w:rsid w:val="006328F8"/>
+    <w:rsid w:val="00687A63"/>
+    <w:rsid w:val="006C5A8F"/>
+    <w:rsid w:val="006F47D7"/>
+    <w:rsid w:val="007D2061"/>
+    <w:rsid w:val="008152D4"/>
+    <w:rsid w:val="00834693"/>
+    <w:rsid w:val="008642A6"/>
+    <w:rsid w:val="008678E9"/>
+    <w:rsid w:val="008A6EE8"/>
+    <w:rsid w:val="008B79CE"/>
+    <w:rsid w:val="008D2028"/>
+    <w:rsid w:val="00925589"/>
+    <w:rsid w:val="00991ADC"/>
+    <w:rsid w:val="00A1684C"/>
+    <w:rsid w:val="00A20EC9"/>
+    <w:rsid w:val="00A45916"/>
+    <w:rsid w:val="00A91CFF"/>
+    <w:rsid w:val="00AB538C"/>
+    <w:rsid w:val="00B1183A"/>
+    <w:rsid w:val="00B276E3"/>
+    <w:rsid w:val="00B31B91"/>
+    <w:rsid w:val="00B56304"/>
+    <w:rsid w:val="00B74FCE"/>
+    <w:rsid w:val="00B86DAD"/>
+    <w:rsid w:val="00CC2BA9"/>
+    <w:rsid w:val="00CD48DA"/>
+    <w:rsid w:val="00CE2AA2"/>
+    <w:rsid w:val="00D20C29"/>
+    <w:rsid w:val="00D60774"/>
+    <w:rsid w:val="00D616C2"/>
+    <w:rsid w:val="00E17F27"/>
+    <w:rsid w:val="00E30DD3"/>
+    <w:rsid w:val="00E40EAC"/>
+    <w:rsid w:val="00E92FEC"/>
+    <w:rsid w:val="00EA5CC9"/>
+    <w:rsid w:val="00ED416F"/>
+    <w:rsid w:val="00F26EE8"/>
+    <w:rsid w:val="00F33D95"/>
+    <w:rsid w:val="00F53065"/>
+    <w:rsid w:val="00F71F16"/>
+    <w:rsid w:val="00FA1157"/>
+  </w:rsids>
+  <m:mathPr>
+    <m:mathFont m:val="Cambria Math"/>
+    <m:brkBin m:val="before"/>
+    <m:brkBinSub m:val="--"/>
+    <m:smallFrac m:val="0"/>
+    <m:dispDef/>
+    <m:lMargin m:val="0"/>
+    <m:rMargin m:val="0"/>
+    <m:defJc m:val="centerGroup"/>
+    <m:wrapIndent m:val="1440"/>
+    <m:intLim m:val="subSup"/>
+    <m:naryLim m:val="undOvr"/>
+  </m:mathPr>
+  <w:themeFontLang w:val="en-IN"/>
+  <w:clrSchemeMapping w:bg1="light1" w:t1="dark1" w:bg2="light2" w:t2="dark2" w:accent1="accent1" w:accent2="accent2" w:accent3="accent3" w:accent4="accent4" w:accent5="accent5" w:accent6="accent6" w:hyperlink="hyperlink" w:followedHyperlink="followedHyperlink"/>
+  <w:doNotIncludeSubdocsInStats/>
+  <w:shapeDefaults>
+    <o:shapedefaults v:ext="edit" spidmax="1026"/>
+    <o:shapelayout v:ext="edit">
+      <o:idmap v:ext="edit" data="1"/>
+    </o:shapelayout>
+  </w:shapeDefaults>
+  <w:decimalSymbol w:val="."/>
+  <w:listSeparator w:val=","/>
+  <w14:docId w14:val="256EC68A"/>
+  <w15:docId w15:val="{C8D8E48E-0819-4023-9FCE-CD797B60FEE2}"/>
+</w:settings>
+</file>
+
+<file path=word\styles.xml><?xml version="1.0" encoding="utf-8"?>
 <w:styles xmlns:mc="http://schemas.openxmlformats.org/markup-compatibility/2006" xmlns:r="http://schemas.openxmlformats.org/officeDocument/2006/relationships" xmlns:w="http://schemas.openxmlformats.org/wordprocessingml/2006/main" xmlns:w14="http://schemas.microsoft.com/office/word/2010/wordml" xmlns:w15="http://schemas.microsoft.com/office/word/2012/wordml" xmlns:w16cex="http://schemas.microsoft.com/office/word/2018/wordml/cex" xmlns:w16cid="http://schemas.microsoft.com/office/word/2016/wordml/cid" xmlns:w16="http://schemas.microsoft.com/office/word/2018/wordml" xmlns:w16du="http://schemas.microsoft.com/office/word/2023/wordml/word16du" xmlns:w16sdtdh="http://schemas.microsoft.com/office/word/2020/wordml/sdtdatahash" xmlns:w16sdtfl="http://schemas.microsoft.com/office/word/2024/wordml/sdtformatlock" xmlns:w16se="http://schemas.microsoft.com/office/word/2015/wordml/symex" mc:Ignorable="w14 w15 w16se w16cid w16 w16cex w16sdtdh w16sdtfl w16du">
   <w:docDefaults>
     <w:rPrDefault>
@@ -1578,7 +1765,7 @@
 </w:styles>
 </file>
 
-<file path=word/theme/theme1.xml><?xml version="1.0" encoding="utf-8"?>
+<file path=word\theme\theme1.xml><?xml version="1.0" encoding="utf-8"?>
 <a:theme xmlns:a="http://schemas.openxmlformats.org/drawingml/2006/main" name="Office Theme">
   <a:themeElements>
     <a:clrScheme name="Office">
@@ -1871,4 +2058,8 @@
     </a:ext>
   </a:extLst>
 </a:theme>
+</file>
+
+<file path=word\webSettings.xml><?xml version="1.0" encoding="utf-8"?>
+<w:webSettings xmlns:mc="http://schemas.openxmlformats.org/markup-compatibility/2006" xmlns:r="http://schemas.openxmlformats.org/officeDocument/2006/relationships" xmlns:w="http://schemas.openxmlformats.org/wordprocessingml/2006/main" xmlns:w14="http://schemas.microsoft.com/office/word/2010/wordml" xmlns:w15="http://schemas.microsoft.com/office/word/2012/wordml" xmlns:w16cex="http://schemas.microsoft.com/office/word/2018/wordml/cex" xmlns:w16cid="http://schemas.microsoft.com/office/word/2016/wordml/cid" xmlns:w16="http://schemas.microsoft.com/office/word/2018/wordml" xmlns:w16du="http://schemas.microsoft.com/office/word/2023/wordml/word16du" xmlns:w16sdtdh="http://schemas.microsoft.com/office/word/2020/wordml/sdtdatahash" xmlns:w16sdtfl="http://schemas.microsoft.com/office/word/2024/wordml/sdtformatlock" xmlns:w16se="http://schemas.microsoft.com/office/word/2015/wordml/symex" mc:Ignorable="w14 w15 w16se w16cid w16 w16cex w16sdtdh w16sdtfl w16du"/>
 </file>
</xml_diff>